<commit_message>
feat: add responsive counter dashboard template with real-time monitoring layout
</commit_message>
<xml_diff>
--- a/메뉴_트리구조.docx
+++ b/메뉴_트리구조.docx
@@ -306,6 +306,344 @@
       <w:r>
         <w:t xml:space="preserve">    end</w:t>
       </w:r>
+      <w:r>
+        <w:rPr>
+          <w:lang/>
+          <w:rtl w:val="off"/>
+        </w:rPr>
+        <w:br/>
+      </w:r>
+    </w:p>
+    <w:p>
+      <w:pPr>
+        <w:spacing w:line="240"/>
+      </w:pPr>
+      <w:r>
+        <w:br w:type="page"/>
+      </w:r>
+    </w:p>
+    <w:p>
+      <w:pPr>
+        <w:ind w:left="0" w:right="0" w:firstLine="0"/>
+        <w:shd w:val="clear" w:color="auto" w:fill="252526"/>
+        <w:spacing w:after="0" w:before="0" w:line="240"/>
+        <w:rPr>
+          <w:caps w:val="off"/>
+          <w:rFonts w:ascii="Segoe WPC" w:eastAsia="Segoe WPC" w:hAnsi="Segoe WPC" w:cs="Segoe WPC"/>
+          <w:b w:val="0"/>
+          <w:i w:val="0"/>
+          <w:color w:val="CCCCCC"/>
+        </w:rPr>
+      </w:pPr>
+      <w:r>
+        <w:rPr>
+          <w:caps w:val="off"/>
+          <w:rFonts w:ascii="Segoe WPC" w:eastAsia="Segoe WPC" w:hAnsi="Segoe WPC" w:cs="Segoe WPC"/>
+          <w:b w:val="0"/>
+          <w:i w:val="0"/>
+          <w:color w:val="CCCCCC"/>
+        </w:rPr>
+        <w:t>🚀 사용자님의 도메인 진화 연대기</w:t>
+      </w:r>
+    </w:p>
+    <w:p>
+      <w:pPr>
+        <w:numPr>
+          <w:ilvl w:val="0"/>
+          <w:numId w:val="1"/>
+        </w:numPr>
+        <w:spacing w:line="240"/>
+        <w:rPr>
+          <w:b w:val="0"/>
+        </w:rPr>
+      </w:pPr>
+      <w:r>
+        <w:rPr/>
+        <w:t>[실험기] Flask (localhost:8899 / 10000)</w:t>
+      </w:r>
+    </w:p>
+    <w:p>
+      <w:pPr>
+        <w:numPr>
+          <w:ilvl w:val="1"/>
+          <w:numId w:val="2"/>
+        </w:numPr>
+        <w:spacing w:line="240"/>
+        <w:rPr>
+          <w:b w:val="0"/>
+        </w:rPr>
+      </w:pPr>
+      <w:r>
+        <w:rPr/>
+        <w:t>내용</w:t>
+      </w:r>
+      <w:r>
+        <w:rPr/>
+        <w:t>: "내 컴퓨터 창안에서만" 작동하던 시기.</w:t>
+      </w:r>
+    </w:p>
+    <w:p>
+      <w:pPr>
+        <w:numPr>
+          <w:ilvl w:val="1"/>
+          <w:numId w:val="2"/>
+        </w:numPr>
+        <w:spacing w:line="240"/>
+        <w:rPr>
+          <w:b w:val="0"/>
+        </w:rPr>
+      </w:pPr>
+      <w:r>
+        <w:rPr/>
+        <w:t>한계</w:t>
+      </w:r>
+      <w:r>
+        <w:rPr/>
+        <w:t>: 나만 볼 수 있고, 남들에게는 안 보여서 장사가 불가능했음.</w:t>
+      </w:r>
+    </w:p>
+    <w:p>
+      <w:pPr>
+        <w:numPr>
+          <w:ilvl w:val="0"/>
+          <w:numId w:val="1"/>
+        </w:numPr>
+        <w:spacing w:line="240"/>
+        <w:rPr>
+          <w:b w:val="0"/>
+        </w:rPr>
+      </w:pPr>
+      <w:r>
+        <w:rPr/>
+        <w:t>[개척기] Gabia (공인 IP -&gt; chicvill.store)</w:t>
+      </w:r>
+    </w:p>
+    <w:p>
+      <w:pPr>
+        <w:numPr>
+          <w:ilvl w:val="1"/>
+          <w:numId w:val="3"/>
+        </w:numPr>
+        <w:spacing w:line="240"/>
+        <w:rPr>
+          <w:b w:val="0"/>
+        </w:rPr>
+      </w:pPr>
+      <w:r>
+        <w:rPr/>
+        <w:t>내용</w:t>
+      </w:r>
+      <w:r>
+        <w:rPr/>
+        <w:t>: 가비아에서 도메인을 사서 내 집에 있는 인터넷(공인 IP)과 직접 연결하려던 시기.</w:t>
+      </w:r>
+    </w:p>
+    <w:p>
+      <w:pPr>
+        <w:numPr>
+          <w:ilvl w:val="1"/>
+          <w:numId w:val="3"/>
+        </w:numPr>
+        <w:spacing w:line="240"/>
+        <w:rPr>
+          <w:b w:val="0"/>
+        </w:rPr>
+      </w:pPr>
+      <w:r>
+        <w:rPr/>
+        <w:t>한계</w:t>
+      </w:r>
+      <w:r>
+        <w:rPr/>
+        <w:t>: 보안에 취약하고, 집 인터넷 주소가 바뀌면 매번 설정을 바꿔줘야 하는 번거로움이 있었음.</w:t>
+      </w:r>
+    </w:p>
+    <w:p>
+      <w:pPr>
+        <w:numPr>
+          <w:ilvl w:val="0"/>
+          <w:numId w:val="1"/>
+        </w:numPr>
+        <w:spacing w:line="240"/>
+        <w:rPr>
+          <w:b w:val="0"/>
+        </w:rPr>
+      </w:pPr>
+      <w:r>
+        <w:rPr/>
+        <w:t>[보안기] Cloudflare Tunnel (localhost -&gt; free.chicvill.store)</w:t>
+      </w:r>
+    </w:p>
+    <w:p>
+      <w:pPr>
+        <w:numPr>
+          <w:ilvl w:val="1"/>
+          <w:numId w:val="4"/>
+        </w:numPr>
+        <w:spacing w:line="240"/>
+        <w:rPr>
+          <w:b w:val="0"/>
+        </w:rPr>
+      </w:pPr>
+      <w:r>
+        <w:rPr/>
+        <w:t>내용</w:t>
+      </w:r>
+      <w:r>
+        <w:rPr/>
+        <w:t>: "우리 집에 안전한 터널을 뚫자!"라고 결심한 시기.</w:t>
+      </w:r>
+    </w:p>
+    <w:p>
+      <w:pPr>
+        <w:numPr>
+          <w:ilvl w:val="1"/>
+          <w:numId w:val="4"/>
+        </w:numPr>
+        <w:spacing w:line="240"/>
+        <w:rPr/>
+      </w:pPr>
+      <w:r>
+        <w:rPr/>
+        <w:t>장점</w:t>
+      </w:r>
+      <w:r>
+        <w:rPr/>
+        <w:t>: 집 주소를 공개하지 않고도</w:t>
+      </w:r>
+      <w:r>
+        <w:rPr/>
+        <w:t>free</w:t>
+      </w:r>
+      <w:r>
+        <w:rPr/>
+        <w:t>라는 예쁜 이름으로 외부 손님을 받을 수 있게 됨.</w:t>
+      </w:r>
+    </w:p>
+    <w:p>
+      <w:pPr>
+        <w:numPr>
+          <w:ilvl w:val="1"/>
+          <w:numId w:val="4"/>
+        </w:numPr>
+        <w:spacing w:line="240"/>
+        <w:rPr>
+          <w:b w:val="0"/>
+        </w:rPr>
+      </w:pPr>
+      <w:r>
+        <w:rPr/>
+        <w:t>한계</w:t>
+      </w:r>
+      <w:r>
+        <w:rPr/>
+        <w:t>: **"컴퓨터를 안 끄면 되잖아?"**라고 생각했지만, 실제로 해보니 컴퓨터 관리와 전기세, 안정성이 신경 쓰임. (오늘 1033 에러가 그 증거!)</w:t>
+      </w:r>
+    </w:p>
+    <w:p>
+      <w:pPr>
+        <w:numPr>
+          <w:ilvl w:val="0"/>
+          <w:numId w:val="1"/>
+        </w:numPr>
+        <w:spacing w:line="240"/>
+        <w:rPr>
+          <w:b w:val="0"/>
+        </w:rPr>
+      </w:pPr>
+      <w:r>
+        <w:rPr/>
+        <w:t>[완성기] Render (suragol.onrender.com + free.chicvill.store) 🏆</w:t>
+      </w:r>
+    </w:p>
+    <w:p>
+      <w:pPr>
+        <w:numPr>
+          <w:ilvl w:val="1"/>
+          <w:numId w:val="5"/>
+        </w:numPr>
+        <w:spacing w:line="240"/>
+        <w:rPr>
+          <w:b w:val="0"/>
+        </w:rPr>
+      </w:pPr>
+      <w:r>
+        <w:rPr/>
+        <w:t>내용</w:t>
+      </w:r>
+      <w:r>
+        <w:rPr/>
+        <w:t>: "에이, 컴퓨터를 그냥 인터넷 세상(클라우드)으로 옮겨버리자!"라고 결정한 현재 단계.</w:t>
+      </w:r>
+    </w:p>
+    <w:p>
+      <w:pPr>
+        <w:ind w:left="2160" w:hanging="360"/>
+        <w:tabs>
+          <w:tab w:val="num" w:pos="2160"/>
+        </w:tabs>
+        <w:spacing w:line="240"/>
+        <w:rPr/>
+      </w:pPr>
+      <w:r>
+        <w:rPr/>
+        <w:t>결과</w:t>
+      </w:r>
+      <w:r>
+        <w:rPr/>
+        <w:t>:</w:t>
+      </w:r>
+      <w:r>
+        <w:rPr/>
+        <w:t>모든 고민이 해결됨.</w:t>
+      </w:r>
+    </w:p>
+    <w:p>
+      <w:pPr>
+        <w:numPr>
+          <w:ilvl w:val="2"/>
+          <w:numId w:val="6"/>
+        </w:numPr>
+        <w:spacing w:line="240"/>
+        <w:rPr/>
+      </w:pPr>
+      <w:r>
+        <w:rPr/>
+        <w:t>컴퓨터 꺼도 됨.</w:t>
+      </w:r>
+    </w:p>
+    <w:p>
+      <w:pPr>
+        <w:numPr>
+          <w:ilvl w:val="2"/>
+          <w:numId w:val="6"/>
+        </w:numPr>
+        <w:spacing w:line="240"/>
+        <w:rPr/>
+      </w:pPr>
+      <w:r>
+        <w:rPr/>
+        <w:t>도메인 이름은 그대로 유지.</w:t>
+      </w:r>
+    </w:p>
+    <w:p>
+      <w:pPr>
+        <w:numPr>
+          <w:ilvl w:val="2"/>
+          <w:numId w:val="6"/>
+        </w:numPr>
+        <w:spacing w:line="240"/>
+        <w:rPr/>
+      </w:pPr>
+      <w:r>
+        <w:rPr/>
+        <w:t>보안성 극대화.</w:t>
+      </w:r>
+    </w:p>
+    <w:p>
+      <w:pPr>
+        <w:spacing w:line="240"/>
+      </w:pPr>
     </w:p>
     <w:p/>
     <w:sectPr>
@@ -317,6 +655,779 @@
     </w:sectPr>
   </w:body>
 </w:document>
+</file>
+
+<file path=word/numbering.xml><?xml version="1.0" encoding="utf-8"?>
+<w:numbering xmlns:ve="http://schemas.openxmlformats.org/markup-compatibility/2006" xmlns:o="urn:schemas-microsoft-com:office:office" xmlns:r="http://schemas.openxmlformats.org/officeDocument/2006/relationships" xmlns:m="http://schemas.openxmlformats.org/officeDocument/2006/math" xmlns:v="urn:schemas-microsoft-com:vml" xmlns:wp="http://schemas.openxmlformats.org/drawingml/2006/wordprocessingDrawing" xmlns:w10="urn:schemas-microsoft-com:office:word" xmlns:w="http://schemas.openxmlformats.org/wordprocessingml/2006/main" xmlns:w14="http://schemas.microsoft.com/office/word/2010/wordml" xmlns:wne="http://schemas.microsoft.com/office/word/2006/wordml">
+  <w:abstractNum w:abstractNumId="0">
+    <w:nsid w:val="1"/>
+    <w:multiLevelType w:val="multilevel"/>
+    <w:lvl w:ilvl="0">
+      <w:start w:val="1"/>
+      <w:lvlText w:val="%1."/>
+      <w:lvlJc w:val="left"/>
+      <w:pPr>
+        <w:ind w:left="720" w:hanging="360" w:firstLine="0"/>
+        <w:shd w:val="clear" w:color="auto" w:fill="252526"/>
+        <w:tabs>
+          <w:tab w:val="num" w:pos="720"/>
+        </w:tabs>
+      </w:pPr>
+    </w:lvl>
+    <w:lvl w:ilvl="1">
+      <w:start w:val="1"/>
+      <w:lvlText w:val="%2."/>
+      <w:lvlJc w:val="left"/>
+      <w:pPr>
+        <w:ind w:left="1440" w:hanging="360" w:firstLine="0"/>
+        <w:shd w:val="clear" w:color="auto" w:fill="252526"/>
+        <w:tabs>
+          <w:tab w:val="num" w:pos="1440"/>
+        </w:tabs>
+      </w:pPr>
+    </w:lvl>
+    <w:lvl w:ilvl="2">
+      <w:start w:val="1"/>
+      <w:lvlText w:val="%3."/>
+      <w:lvlJc w:val="left"/>
+      <w:pPr>
+        <w:ind w:left="2160" w:hanging="360" w:firstLine="0"/>
+        <w:shd w:val="clear" w:color="auto" w:fill="252526"/>
+        <w:tabs>
+          <w:tab w:val="num" w:pos="2160"/>
+        </w:tabs>
+      </w:pPr>
+    </w:lvl>
+    <w:lvl w:ilvl="3">
+      <w:start w:val="1"/>
+      <w:lvlText w:val="%4."/>
+      <w:lvlJc w:val="left"/>
+      <w:pPr>
+        <w:ind w:left="2880" w:hanging="360" w:firstLine="0"/>
+        <w:shd w:val="clear" w:color="auto" w:fill="252526"/>
+        <w:tabs>
+          <w:tab w:val="num" w:pos="2880"/>
+        </w:tabs>
+      </w:pPr>
+    </w:lvl>
+    <w:lvl w:ilvl="4">
+      <w:start w:val="1"/>
+      <w:lvlText w:val="%5."/>
+      <w:lvlJc w:val="left"/>
+      <w:pPr>
+        <w:ind w:left="3600" w:hanging="360" w:firstLine="0"/>
+        <w:shd w:val="clear" w:color="auto" w:fill="252526"/>
+        <w:tabs>
+          <w:tab w:val="num" w:pos="3600"/>
+        </w:tabs>
+      </w:pPr>
+    </w:lvl>
+    <w:lvl w:ilvl="5">
+      <w:start w:val="1"/>
+      <w:lvlText w:val="%6."/>
+      <w:lvlJc w:val="left"/>
+      <w:pPr>
+        <w:ind w:left="4320" w:hanging="360" w:firstLine="0"/>
+        <w:shd w:val="clear" w:color="auto" w:fill="252526"/>
+        <w:tabs>
+          <w:tab w:val="num" w:pos="4320"/>
+        </w:tabs>
+      </w:pPr>
+    </w:lvl>
+    <w:lvl w:ilvl="6">
+      <w:start w:val="1"/>
+      <w:lvlText w:val="%7."/>
+      <w:lvlJc w:val="left"/>
+      <w:pPr>
+        <w:ind w:left="5040" w:hanging="360" w:firstLine="0"/>
+        <w:shd w:val="clear" w:color="auto" w:fill="252526"/>
+        <w:tabs>
+          <w:tab w:val="num" w:pos="5040"/>
+        </w:tabs>
+      </w:pPr>
+    </w:lvl>
+    <w:lvl w:ilvl="7">
+      <w:start w:val="1"/>
+      <w:lvlText w:val="%8."/>
+      <w:lvlJc w:val="left"/>
+      <w:pPr>
+        <w:ind w:left="5760" w:hanging="360" w:firstLine="0"/>
+        <w:shd w:val="clear" w:color="auto" w:fill="252526"/>
+        <w:tabs>
+          <w:tab w:val="num" w:pos="5760"/>
+        </w:tabs>
+      </w:pPr>
+    </w:lvl>
+    <w:lvl w:ilvl="8">
+      <w:start w:val="1"/>
+      <w:lvlText w:val="%9."/>
+      <w:lvlJc w:val="left"/>
+      <w:pPr>
+        <w:ind w:left="6480" w:hanging="360" w:firstLine="0"/>
+        <w:shd w:val="clear" w:color="auto" w:fill="252526"/>
+        <w:tabs>
+          <w:tab w:val="num" w:pos="6480"/>
+        </w:tabs>
+      </w:pPr>
+    </w:lvl>
+  </w:abstractNum>
+  <w:abstractNum w:abstractNumId="1">
+    <w:nsid w:val="1"/>
+    <w:multiLevelType w:val="multilevel"/>
+    <w:lvl w:ilvl="0">
+      <w:start w:val="1"/>
+      <w:lvlText w:val="%1."/>
+      <w:lvlJc w:val="left"/>
+      <w:pPr>
+        <w:ind w:left="720" w:hanging="360" w:firstLine="0"/>
+        <w:shd w:val="clear" w:color="auto" w:fill="252526"/>
+        <w:tabs>
+          <w:tab w:val="num" w:pos="720"/>
+        </w:tabs>
+      </w:pPr>
+    </w:lvl>
+    <w:lvl w:ilvl="1">
+      <w:start w:val="1"/>
+      <w:lvlText w:val="%2."/>
+      <w:lvlJc w:val="left"/>
+      <w:pPr>
+        <w:ind w:left="1440" w:hanging="360" w:firstLine="0"/>
+        <w:shd w:val="clear" w:color="auto" w:fill="252526"/>
+        <w:tabs>
+          <w:tab w:val="num" w:pos="1440"/>
+        </w:tabs>
+      </w:pPr>
+    </w:lvl>
+    <w:lvl w:ilvl="2">
+      <w:start w:val="1"/>
+      <w:lvlText w:val="%3."/>
+      <w:lvlJc w:val="left"/>
+      <w:pPr>
+        <w:ind w:left="2160" w:hanging="360" w:firstLine="0"/>
+        <w:shd w:val="clear" w:color="auto" w:fill="252526"/>
+        <w:tabs>
+          <w:tab w:val="num" w:pos="2160"/>
+        </w:tabs>
+      </w:pPr>
+    </w:lvl>
+    <w:lvl w:ilvl="3">
+      <w:start w:val="1"/>
+      <w:lvlText w:val="%4."/>
+      <w:lvlJc w:val="left"/>
+      <w:pPr>
+        <w:ind w:left="2880" w:hanging="360" w:firstLine="0"/>
+        <w:shd w:val="clear" w:color="auto" w:fill="252526"/>
+        <w:tabs>
+          <w:tab w:val="num" w:pos="2880"/>
+        </w:tabs>
+      </w:pPr>
+    </w:lvl>
+    <w:lvl w:ilvl="4">
+      <w:start w:val="1"/>
+      <w:lvlText w:val="%5."/>
+      <w:lvlJc w:val="left"/>
+      <w:pPr>
+        <w:ind w:left="3600" w:hanging="360" w:firstLine="0"/>
+        <w:shd w:val="clear" w:color="auto" w:fill="252526"/>
+        <w:tabs>
+          <w:tab w:val="num" w:pos="3600"/>
+        </w:tabs>
+      </w:pPr>
+    </w:lvl>
+    <w:lvl w:ilvl="5">
+      <w:start w:val="1"/>
+      <w:lvlText w:val="%6."/>
+      <w:lvlJc w:val="left"/>
+      <w:pPr>
+        <w:ind w:left="4320" w:hanging="360" w:firstLine="0"/>
+        <w:shd w:val="clear" w:color="auto" w:fill="252526"/>
+        <w:tabs>
+          <w:tab w:val="num" w:pos="4320"/>
+        </w:tabs>
+      </w:pPr>
+    </w:lvl>
+    <w:lvl w:ilvl="6">
+      <w:start w:val="1"/>
+      <w:lvlText w:val="%7."/>
+      <w:lvlJc w:val="left"/>
+      <w:pPr>
+        <w:ind w:left="5040" w:hanging="360" w:firstLine="0"/>
+        <w:shd w:val="clear" w:color="auto" w:fill="252526"/>
+        <w:tabs>
+          <w:tab w:val="num" w:pos="5040"/>
+        </w:tabs>
+      </w:pPr>
+    </w:lvl>
+    <w:lvl w:ilvl="7">
+      <w:start w:val="1"/>
+      <w:lvlText w:val="%8."/>
+      <w:lvlJc w:val="left"/>
+      <w:pPr>
+        <w:ind w:left="5760" w:hanging="360" w:firstLine="0"/>
+        <w:shd w:val="clear" w:color="auto" w:fill="252526"/>
+        <w:tabs>
+          <w:tab w:val="num" w:pos="5760"/>
+        </w:tabs>
+      </w:pPr>
+    </w:lvl>
+    <w:lvl w:ilvl="8">
+      <w:start w:val="1"/>
+      <w:lvlText w:val="%9."/>
+      <w:lvlJc w:val="left"/>
+      <w:pPr>
+        <w:ind w:left="6480" w:hanging="360" w:firstLine="0"/>
+        <w:shd w:val="clear" w:color="auto" w:fill="252526"/>
+        <w:tabs>
+          <w:tab w:val="num" w:pos="6480"/>
+        </w:tabs>
+      </w:pPr>
+    </w:lvl>
+  </w:abstractNum>
+  <w:abstractNum w:abstractNumId="2">
+    <w:nsid w:val="1"/>
+    <w:multiLevelType w:val="multilevel"/>
+    <w:lvl w:ilvl="0">
+      <w:start w:val="1"/>
+      <w:lvlText w:val="%1."/>
+      <w:lvlJc w:val="left"/>
+      <w:pPr>
+        <w:ind w:left="720" w:hanging="360" w:firstLine="0"/>
+        <w:shd w:val="clear" w:color="auto" w:fill="252526"/>
+        <w:tabs>
+          <w:tab w:val="num" w:pos="720"/>
+        </w:tabs>
+      </w:pPr>
+    </w:lvl>
+    <w:lvl w:ilvl="1">
+      <w:start w:val="1"/>
+      <w:lvlText w:val="%2."/>
+      <w:lvlJc w:val="left"/>
+      <w:pPr>
+        <w:ind w:left="1440" w:hanging="360" w:firstLine="0"/>
+        <w:shd w:val="clear" w:color="auto" w:fill="252526"/>
+        <w:tabs>
+          <w:tab w:val="num" w:pos="1440"/>
+        </w:tabs>
+      </w:pPr>
+    </w:lvl>
+    <w:lvl w:ilvl="2">
+      <w:start w:val="1"/>
+      <w:lvlText w:val="%3."/>
+      <w:lvlJc w:val="left"/>
+      <w:pPr>
+        <w:ind w:left="2160" w:hanging="360" w:firstLine="0"/>
+        <w:shd w:val="clear" w:color="auto" w:fill="252526"/>
+        <w:tabs>
+          <w:tab w:val="num" w:pos="2160"/>
+        </w:tabs>
+      </w:pPr>
+    </w:lvl>
+    <w:lvl w:ilvl="3">
+      <w:start w:val="1"/>
+      <w:lvlText w:val="%4."/>
+      <w:lvlJc w:val="left"/>
+      <w:pPr>
+        <w:ind w:left="2880" w:hanging="360" w:firstLine="0"/>
+        <w:shd w:val="clear" w:color="auto" w:fill="252526"/>
+        <w:tabs>
+          <w:tab w:val="num" w:pos="2880"/>
+        </w:tabs>
+      </w:pPr>
+    </w:lvl>
+    <w:lvl w:ilvl="4">
+      <w:start w:val="1"/>
+      <w:lvlText w:val="%5."/>
+      <w:lvlJc w:val="left"/>
+      <w:pPr>
+        <w:ind w:left="3600" w:hanging="360" w:firstLine="0"/>
+        <w:shd w:val="clear" w:color="auto" w:fill="252526"/>
+        <w:tabs>
+          <w:tab w:val="num" w:pos="3600"/>
+        </w:tabs>
+      </w:pPr>
+    </w:lvl>
+    <w:lvl w:ilvl="5">
+      <w:start w:val="1"/>
+      <w:lvlText w:val="%6."/>
+      <w:lvlJc w:val="left"/>
+      <w:pPr>
+        <w:ind w:left="4320" w:hanging="360" w:firstLine="0"/>
+        <w:shd w:val="clear" w:color="auto" w:fill="252526"/>
+        <w:tabs>
+          <w:tab w:val="num" w:pos="4320"/>
+        </w:tabs>
+      </w:pPr>
+    </w:lvl>
+    <w:lvl w:ilvl="6">
+      <w:start w:val="1"/>
+      <w:lvlText w:val="%7."/>
+      <w:lvlJc w:val="left"/>
+      <w:pPr>
+        <w:ind w:left="5040" w:hanging="360" w:firstLine="0"/>
+        <w:shd w:val="clear" w:color="auto" w:fill="252526"/>
+        <w:tabs>
+          <w:tab w:val="num" w:pos="5040"/>
+        </w:tabs>
+      </w:pPr>
+    </w:lvl>
+    <w:lvl w:ilvl="7">
+      <w:start w:val="1"/>
+      <w:lvlText w:val="%8."/>
+      <w:lvlJc w:val="left"/>
+      <w:pPr>
+        <w:ind w:left="5760" w:hanging="360" w:firstLine="0"/>
+        <w:shd w:val="clear" w:color="auto" w:fill="252526"/>
+        <w:tabs>
+          <w:tab w:val="num" w:pos="5760"/>
+        </w:tabs>
+      </w:pPr>
+    </w:lvl>
+    <w:lvl w:ilvl="8">
+      <w:start w:val="1"/>
+      <w:lvlText w:val="%9."/>
+      <w:lvlJc w:val="left"/>
+      <w:pPr>
+        <w:ind w:left="6480" w:hanging="360" w:firstLine="0"/>
+        <w:shd w:val="clear" w:color="auto" w:fill="252526"/>
+        <w:tabs>
+          <w:tab w:val="num" w:pos="6480"/>
+        </w:tabs>
+      </w:pPr>
+    </w:lvl>
+  </w:abstractNum>
+  <w:abstractNum w:abstractNumId="3">
+    <w:nsid w:val="1"/>
+    <w:multiLevelType w:val="multilevel"/>
+    <w:lvl w:ilvl="0">
+      <w:start w:val="1"/>
+      <w:lvlText w:val="%1."/>
+      <w:lvlJc w:val="left"/>
+      <w:pPr>
+        <w:ind w:left="720" w:hanging="360" w:firstLine="0"/>
+        <w:shd w:val="clear" w:color="auto" w:fill="252526"/>
+        <w:tabs>
+          <w:tab w:val="num" w:pos="720"/>
+        </w:tabs>
+      </w:pPr>
+    </w:lvl>
+    <w:lvl w:ilvl="1">
+      <w:start w:val="1"/>
+      <w:lvlText w:val="%2."/>
+      <w:lvlJc w:val="left"/>
+      <w:pPr>
+        <w:ind w:left="1440" w:hanging="360" w:firstLine="0"/>
+        <w:shd w:val="clear" w:color="auto" w:fill="252526"/>
+        <w:tabs>
+          <w:tab w:val="num" w:pos="1440"/>
+        </w:tabs>
+      </w:pPr>
+    </w:lvl>
+    <w:lvl w:ilvl="2">
+      <w:start w:val="1"/>
+      <w:lvlText w:val="%3."/>
+      <w:lvlJc w:val="left"/>
+      <w:pPr>
+        <w:ind w:left="2160" w:hanging="360" w:firstLine="0"/>
+        <w:shd w:val="clear" w:color="auto" w:fill="252526"/>
+        <w:tabs>
+          <w:tab w:val="num" w:pos="2160"/>
+        </w:tabs>
+      </w:pPr>
+    </w:lvl>
+    <w:lvl w:ilvl="3">
+      <w:start w:val="1"/>
+      <w:lvlText w:val="%4."/>
+      <w:lvlJc w:val="left"/>
+      <w:pPr>
+        <w:ind w:left="2880" w:hanging="360" w:firstLine="0"/>
+        <w:shd w:val="clear" w:color="auto" w:fill="252526"/>
+        <w:tabs>
+          <w:tab w:val="num" w:pos="2880"/>
+        </w:tabs>
+      </w:pPr>
+    </w:lvl>
+    <w:lvl w:ilvl="4">
+      <w:start w:val="1"/>
+      <w:lvlText w:val="%5."/>
+      <w:lvlJc w:val="left"/>
+      <w:pPr>
+        <w:ind w:left="3600" w:hanging="360" w:firstLine="0"/>
+        <w:shd w:val="clear" w:color="auto" w:fill="252526"/>
+        <w:tabs>
+          <w:tab w:val="num" w:pos="3600"/>
+        </w:tabs>
+      </w:pPr>
+    </w:lvl>
+    <w:lvl w:ilvl="5">
+      <w:start w:val="1"/>
+      <w:lvlText w:val="%6."/>
+      <w:lvlJc w:val="left"/>
+      <w:pPr>
+        <w:ind w:left="4320" w:hanging="360" w:firstLine="0"/>
+        <w:shd w:val="clear" w:color="auto" w:fill="252526"/>
+        <w:tabs>
+          <w:tab w:val="num" w:pos="4320"/>
+        </w:tabs>
+      </w:pPr>
+    </w:lvl>
+    <w:lvl w:ilvl="6">
+      <w:start w:val="1"/>
+      <w:lvlText w:val="%7."/>
+      <w:lvlJc w:val="left"/>
+      <w:pPr>
+        <w:ind w:left="5040" w:hanging="360" w:firstLine="0"/>
+        <w:shd w:val="clear" w:color="auto" w:fill="252526"/>
+        <w:tabs>
+          <w:tab w:val="num" w:pos="5040"/>
+        </w:tabs>
+      </w:pPr>
+    </w:lvl>
+    <w:lvl w:ilvl="7">
+      <w:start w:val="1"/>
+      <w:lvlText w:val="%8."/>
+      <w:lvlJc w:val="left"/>
+      <w:pPr>
+        <w:ind w:left="5760" w:hanging="360" w:firstLine="0"/>
+        <w:shd w:val="clear" w:color="auto" w:fill="252526"/>
+        <w:tabs>
+          <w:tab w:val="num" w:pos="5760"/>
+        </w:tabs>
+      </w:pPr>
+    </w:lvl>
+    <w:lvl w:ilvl="8">
+      <w:start w:val="1"/>
+      <w:lvlText w:val="%9."/>
+      <w:lvlJc w:val="left"/>
+      <w:pPr>
+        <w:ind w:left="6480" w:hanging="360" w:firstLine="0"/>
+        <w:shd w:val="clear" w:color="auto" w:fill="252526"/>
+        <w:tabs>
+          <w:tab w:val="num" w:pos="6480"/>
+        </w:tabs>
+      </w:pPr>
+    </w:lvl>
+  </w:abstractNum>
+  <w:abstractNum w:abstractNumId="4">
+    <w:nsid w:val="1"/>
+    <w:multiLevelType w:val="multilevel"/>
+    <w:lvl w:ilvl="0">
+      <w:start w:val="1"/>
+      <w:lvlText w:val="%1."/>
+      <w:lvlJc w:val="left"/>
+      <w:pPr>
+        <w:ind w:left="720" w:hanging="360" w:firstLine="0"/>
+        <w:shd w:val="clear" w:color="auto" w:fill="252526"/>
+        <w:tabs>
+          <w:tab w:val="num" w:pos="720"/>
+        </w:tabs>
+      </w:pPr>
+    </w:lvl>
+    <w:lvl w:ilvl="1">
+      <w:start w:val="1"/>
+      <w:lvlText w:val="%2."/>
+      <w:lvlJc w:val="left"/>
+      <w:pPr>
+        <w:ind w:left="1440" w:hanging="360" w:firstLine="0"/>
+        <w:shd w:val="clear" w:color="auto" w:fill="252526"/>
+        <w:tabs>
+          <w:tab w:val="num" w:pos="1440"/>
+        </w:tabs>
+      </w:pPr>
+    </w:lvl>
+    <w:lvl w:ilvl="2">
+      <w:start w:val="1"/>
+      <w:lvlText w:val="%3."/>
+      <w:lvlJc w:val="left"/>
+      <w:pPr>
+        <w:ind w:left="2160" w:hanging="360" w:firstLine="0"/>
+        <w:shd w:val="clear" w:color="auto" w:fill="252526"/>
+        <w:tabs>
+          <w:tab w:val="num" w:pos="2160"/>
+        </w:tabs>
+      </w:pPr>
+    </w:lvl>
+    <w:lvl w:ilvl="3">
+      <w:start w:val="1"/>
+      <w:lvlText w:val="%4."/>
+      <w:lvlJc w:val="left"/>
+      <w:pPr>
+        <w:ind w:left="2880" w:hanging="360" w:firstLine="0"/>
+        <w:shd w:val="clear" w:color="auto" w:fill="252526"/>
+        <w:tabs>
+          <w:tab w:val="num" w:pos="2880"/>
+        </w:tabs>
+      </w:pPr>
+    </w:lvl>
+    <w:lvl w:ilvl="4">
+      <w:start w:val="1"/>
+      <w:lvlText w:val="%5."/>
+      <w:lvlJc w:val="left"/>
+      <w:pPr>
+        <w:ind w:left="3600" w:hanging="360" w:firstLine="0"/>
+        <w:shd w:val="clear" w:color="auto" w:fill="252526"/>
+        <w:tabs>
+          <w:tab w:val="num" w:pos="3600"/>
+        </w:tabs>
+      </w:pPr>
+    </w:lvl>
+    <w:lvl w:ilvl="5">
+      <w:start w:val="1"/>
+      <w:lvlText w:val="%6."/>
+      <w:lvlJc w:val="left"/>
+      <w:pPr>
+        <w:ind w:left="4320" w:hanging="360" w:firstLine="0"/>
+        <w:shd w:val="clear" w:color="auto" w:fill="252526"/>
+        <w:tabs>
+          <w:tab w:val="num" w:pos="4320"/>
+        </w:tabs>
+      </w:pPr>
+    </w:lvl>
+    <w:lvl w:ilvl="6">
+      <w:start w:val="1"/>
+      <w:lvlText w:val="%7."/>
+      <w:lvlJc w:val="left"/>
+      <w:pPr>
+        <w:ind w:left="5040" w:hanging="360" w:firstLine="0"/>
+        <w:shd w:val="clear" w:color="auto" w:fill="252526"/>
+        <w:tabs>
+          <w:tab w:val="num" w:pos="5040"/>
+        </w:tabs>
+      </w:pPr>
+    </w:lvl>
+    <w:lvl w:ilvl="7">
+      <w:start w:val="1"/>
+      <w:lvlText w:val="%8."/>
+      <w:lvlJc w:val="left"/>
+      <w:pPr>
+        <w:ind w:left="5760" w:hanging="360" w:firstLine="0"/>
+        <w:shd w:val="clear" w:color="auto" w:fill="252526"/>
+        <w:tabs>
+          <w:tab w:val="num" w:pos="5760"/>
+        </w:tabs>
+      </w:pPr>
+    </w:lvl>
+    <w:lvl w:ilvl="8">
+      <w:start w:val="1"/>
+      <w:lvlText w:val="%9."/>
+      <w:lvlJc w:val="left"/>
+      <w:pPr>
+        <w:ind w:left="6480" w:hanging="360" w:firstLine="0"/>
+        <w:shd w:val="clear" w:color="auto" w:fill="252526"/>
+        <w:tabs>
+          <w:tab w:val="num" w:pos="6480"/>
+        </w:tabs>
+      </w:pPr>
+    </w:lvl>
+  </w:abstractNum>
+  <w:abstractNum w:abstractNumId="5">
+    <w:nsid w:val="1"/>
+    <w:multiLevelType w:val="multilevel"/>
+    <w:lvl w:ilvl="0">
+      <w:start w:val="1"/>
+      <w:lvlText w:val="%1."/>
+      <w:lvlJc w:val="left"/>
+      <w:pPr>
+        <w:ind w:left="720" w:hanging="360" w:firstLine="0"/>
+        <w:shd w:val="clear" w:color="auto" w:fill="252526"/>
+        <w:tabs>
+          <w:tab w:val="num" w:pos="720"/>
+        </w:tabs>
+      </w:pPr>
+    </w:lvl>
+    <w:lvl w:ilvl="1">
+      <w:start w:val="1"/>
+      <w:lvlText w:val="%2."/>
+      <w:lvlJc w:val="left"/>
+      <w:pPr>
+        <w:ind w:left="1440" w:hanging="360" w:firstLine="0"/>
+        <w:shd w:val="clear" w:color="auto" w:fill="252526"/>
+        <w:tabs>
+          <w:tab w:val="num" w:pos="1440"/>
+        </w:tabs>
+      </w:pPr>
+    </w:lvl>
+    <w:lvl w:ilvl="2">
+      <w:start w:val="1"/>
+      <w:lvlText w:val="%3."/>
+      <w:lvlJc w:val="left"/>
+      <w:pPr>
+        <w:ind w:left="2160" w:hanging="360" w:firstLine="0"/>
+        <w:shd w:val="clear" w:color="auto" w:fill="252526"/>
+        <w:tabs>
+          <w:tab w:val="num" w:pos="2160"/>
+        </w:tabs>
+      </w:pPr>
+    </w:lvl>
+    <w:lvl w:ilvl="3">
+      <w:start w:val="1"/>
+      <w:lvlText w:val="%4."/>
+      <w:lvlJc w:val="left"/>
+      <w:pPr>
+        <w:ind w:left="2880" w:hanging="360" w:firstLine="0"/>
+        <w:shd w:val="clear" w:color="auto" w:fill="252526"/>
+        <w:tabs>
+          <w:tab w:val="num" w:pos="2880"/>
+        </w:tabs>
+      </w:pPr>
+    </w:lvl>
+    <w:lvl w:ilvl="4">
+      <w:start w:val="1"/>
+      <w:lvlText w:val="%5."/>
+      <w:lvlJc w:val="left"/>
+      <w:pPr>
+        <w:ind w:left="3600" w:hanging="360" w:firstLine="0"/>
+        <w:shd w:val="clear" w:color="auto" w:fill="252526"/>
+        <w:tabs>
+          <w:tab w:val="num" w:pos="3600"/>
+        </w:tabs>
+      </w:pPr>
+    </w:lvl>
+    <w:lvl w:ilvl="5">
+      <w:start w:val="1"/>
+      <w:lvlText w:val="%6."/>
+      <w:lvlJc w:val="left"/>
+      <w:pPr>
+        <w:ind w:left="4320" w:hanging="360" w:firstLine="0"/>
+        <w:shd w:val="clear" w:color="auto" w:fill="252526"/>
+        <w:tabs>
+          <w:tab w:val="num" w:pos="4320"/>
+        </w:tabs>
+      </w:pPr>
+    </w:lvl>
+    <w:lvl w:ilvl="6">
+      <w:start w:val="1"/>
+      <w:lvlText w:val="%7."/>
+      <w:lvlJc w:val="left"/>
+      <w:pPr>
+        <w:ind w:left="5040" w:hanging="360" w:firstLine="0"/>
+        <w:shd w:val="clear" w:color="auto" w:fill="252526"/>
+        <w:tabs>
+          <w:tab w:val="num" w:pos="5040"/>
+        </w:tabs>
+      </w:pPr>
+    </w:lvl>
+    <w:lvl w:ilvl="7">
+      <w:start w:val="1"/>
+      <w:lvlText w:val="%8."/>
+      <w:lvlJc w:val="left"/>
+      <w:pPr>
+        <w:ind w:left="5760" w:hanging="360" w:firstLine="0"/>
+        <w:shd w:val="clear" w:color="auto" w:fill="252526"/>
+        <w:tabs>
+          <w:tab w:val="num" w:pos="5760"/>
+        </w:tabs>
+      </w:pPr>
+    </w:lvl>
+    <w:lvl w:ilvl="8">
+      <w:start w:val="1"/>
+      <w:lvlText w:val="%9."/>
+      <w:lvlJc w:val="left"/>
+      <w:pPr>
+        <w:ind w:left="6480" w:hanging="360" w:firstLine="0"/>
+        <w:shd w:val="clear" w:color="auto" w:fill="252526"/>
+        <w:tabs>
+          <w:tab w:val="num" w:pos="6480"/>
+        </w:tabs>
+      </w:pPr>
+    </w:lvl>
+  </w:abstractNum>
+  <w:num w:numId="1">
+    <w:abstractNumId w:val="0"/>
+  </w:num>
+  <w:num w:numId="2">
+    <w:abstractNumId w:val="1"/>
+    <w:lvlOverride w:ilvl="1">
+      <w:lvl w:ilvl="1">
+        <w:start w:val="1"/>
+        <w:lvlText w:val="%2."/>
+        <w:lvlJc w:val="left"/>
+        <w:pPr>
+          <w:ind w:left="1440" w:hanging="360"/>
+          <w:tabs>
+            <w:tab w:val="num" w:pos="1440"/>
+          </w:tabs>
+        </w:pPr>
+      </w:lvl>
+    </w:lvlOverride>
+  </w:num>
+  <w:num w:numId="3">
+    <w:abstractNumId w:val="2"/>
+    <w:lvlOverride w:ilvl="1">
+      <w:lvl w:ilvl="1">
+        <w:start w:val="1"/>
+        <w:lvlText w:val="%2."/>
+        <w:lvlJc w:val="left"/>
+        <w:pPr>
+          <w:ind w:left="1440" w:hanging="360"/>
+          <w:tabs>
+            <w:tab w:val="num" w:pos="1440"/>
+          </w:tabs>
+        </w:pPr>
+      </w:lvl>
+    </w:lvlOverride>
+  </w:num>
+  <w:num w:numId="4">
+    <w:abstractNumId w:val="3"/>
+    <w:lvlOverride w:ilvl="1">
+      <w:lvl w:ilvl="1">
+        <w:start w:val="1"/>
+        <w:lvlText w:val="%2."/>
+        <w:lvlJc w:val="left"/>
+        <w:pPr>
+          <w:ind w:left="1440" w:hanging="360"/>
+          <w:tabs>
+            <w:tab w:val="num" w:pos="1440"/>
+          </w:tabs>
+        </w:pPr>
+      </w:lvl>
+    </w:lvlOverride>
+  </w:num>
+  <w:num w:numId="5">
+    <w:abstractNumId w:val="4"/>
+    <w:lvlOverride w:ilvl="1">
+      <w:lvl w:ilvl="1">
+        <w:start w:val="1"/>
+        <w:lvlText w:val="%2."/>
+        <w:lvlJc w:val="left"/>
+        <w:pPr>
+          <w:ind w:left="1440" w:hanging="360"/>
+          <w:tabs>
+            <w:tab w:val="num" w:pos="1440"/>
+          </w:tabs>
+        </w:pPr>
+      </w:lvl>
+    </w:lvlOverride>
+  </w:num>
+  <w:num w:numId="6">
+    <w:abstractNumId w:val="5"/>
+    <w:lvlOverride w:ilvl="1">
+      <w:lvl w:ilvl="1">
+        <w:start w:val="1"/>
+        <w:lvlText w:val="%2."/>
+        <w:lvlJc w:val="left"/>
+        <w:pPr>
+          <w:ind w:left="1440" w:hanging="360"/>
+          <w:tabs>
+            <w:tab w:val="num" w:pos="1440"/>
+          </w:tabs>
+        </w:pPr>
+      </w:lvl>
+    </w:lvlOverride>
+    <w:lvlOverride w:ilvl="2">
+      <w:lvl w:ilvl="2">
+        <w:start w:val="1"/>
+        <w:lvlText w:val="%3."/>
+        <w:lvlJc w:val="left"/>
+        <w:pPr>
+          <w:ind w:left="2160" w:hanging="360"/>
+          <w:tabs>
+            <w:tab w:val="num" w:pos="2160"/>
+          </w:tabs>
+        </w:pPr>
+      </w:lvl>
+    </w:lvlOverride>
+  </w:num>
+</w:numbering>
 </file>
 
 <file path=word/styles.xml><?xml version="1.0" encoding="utf-8"?>
@@ -358,22 +1469,22 @@
     <w:lsdException w:name="index 7" w:semiHidden="1" w:unhideWhenUsed="1"/>
     <w:lsdException w:name="index 8" w:semiHidden="1" w:unhideWhenUsed="1"/>
     <w:lsdException w:name="index 9" w:semiHidden="1" w:unhideWhenUsed="1"/>
-    <w:lsdException w:name="toc 1" w:semiHidden="1" w:uiPriority="57" w:unhideWhenUsed="1"/>
-    <w:lsdException w:name="toc 2" w:semiHidden="1" w:uiPriority="57" w:unhideWhenUsed="1"/>
-    <w:lsdException w:name="toc 3" w:semiHidden="1" w:uiPriority="57" w:unhideWhenUsed="1"/>
-    <w:lsdException w:name="toc 4" w:semiHidden="1" w:uiPriority="57" w:unhideWhenUsed="1"/>
-    <w:lsdException w:name="toc 5" w:semiHidden="1" w:uiPriority="57" w:unhideWhenUsed="1"/>
-    <w:lsdException w:name="toc 6" w:semiHidden="1" w:uiPriority="57" w:unhideWhenUsed="1"/>
-    <w:lsdException w:name="toc 7" w:semiHidden="1" w:uiPriority="57" w:unhideWhenUsed="1"/>
-    <w:lsdException w:name="toc 8" w:semiHidden="1" w:uiPriority="57" w:unhideWhenUsed="1"/>
-    <w:lsdException w:name="toc 9" w:semiHidden="1" w:uiPriority="57" w:unhideWhenUsed="1"/>
+    <w:lsdException w:name="toc 1" w:semiHidden="1" w:uiPriority="87" w:unhideWhenUsed="1"/>
+    <w:lsdException w:name="toc 2" w:semiHidden="1" w:uiPriority="87" w:unhideWhenUsed="1"/>
+    <w:lsdException w:name="toc 3" w:semiHidden="1" w:uiPriority="87" w:unhideWhenUsed="1"/>
+    <w:lsdException w:name="toc 4" w:semiHidden="1" w:uiPriority="87" w:unhideWhenUsed="1"/>
+    <w:lsdException w:name="toc 5" w:semiHidden="1" w:uiPriority="87" w:unhideWhenUsed="1"/>
+    <w:lsdException w:name="toc 6" w:semiHidden="1" w:uiPriority="87" w:unhideWhenUsed="1"/>
+    <w:lsdException w:name="toc 7" w:semiHidden="1" w:uiPriority="87" w:unhideWhenUsed="1"/>
+    <w:lsdException w:name="toc 8" w:semiHidden="1" w:uiPriority="87" w:unhideWhenUsed="1"/>
+    <w:lsdException w:name="toc 9" w:semiHidden="1" w:uiPriority="87" w:unhideWhenUsed="1"/>
     <w:lsdException w:name="Normal Indent" w:semiHidden="1" w:unhideWhenUsed="1"/>
     <w:lsdException w:name="footnote text" w:semiHidden="1" w:unhideWhenUsed="1"/>
     <w:lsdException w:name="annotation text" w:semiHidden="1" w:unhideWhenUsed="1"/>
     <w:lsdException w:name="header" w:semiHidden="1" w:unhideWhenUsed="1"/>
     <w:lsdException w:name="footer" w:semiHidden="1" w:unhideWhenUsed="1"/>
     <w:lsdException w:name="index heading" w:semiHidden="1" w:unhideWhenUsed="1"/>
-    <w:lsdException w:name="caption" w:semiHidden="1" w:uiPriority="53" w:unhideWhenUsed="1" w:qFormat="1"/>
+    <w:lsdException w:name="caption" w:semiHidden="1" w:uiPriority="83" w:unhideWhenUsed="1" w:qFormat="1"/>
     <w:lsdException w:name="table of figures" w:semiHidden="1" w:unhideWhenUsed="1"/>
     <w:lsdException w:name="envelope address" w:semiHidden="1" w:unhideWhenUsed="1"/>
     <w:lsdException w:name="envelope return" w:semiHidden="1" w:unhideWhenUsed="1"/>
@@ -401,7 +1512,7 @@
     <w:lsdException w:name="List Number 3" w:semiHidden="1" w:unhideWhenUsed="1"/>
     <w:lsdException w:name="List Number 4" w:semiHidden="1" w:unhideWhenUsed="1"/>
     <w:lsdException w:name="List Number 5" w:semiHidden="1" w:unhideWhenUsed="1"/>
-    <w:lsdException w:name="Title" w:uiPriority="16" w:qFormat="1"/>
+    <w:lsdException w:name="Title" w:uiPriority="22" w:qFormat="1"/>
     <w:lsdException w:name="Closing" w:semiHidden="1" w:unhideWhenUsed="1"/>
     <w:lsdException w:name="Signature" w:semiHidden="1" w:unhideWhenUsed="1"/>
     <w:lsdException w:name="Default Paragraph Font" w:semiHidden="1" w:uiPriority="1" w:unhideWhenUsed="1"/>
@@ -413,7 +1524,7 @@
     <w:lsdException w:name="List Continue 4" w:semiHidden="1" w:unhideWhenUsed="1"/>
     <w:lsdException w:name="List Continue 5" w:semiHidden="1" w:unhideWhenUsed="1"/>
     <w:lsdException w:name="Message Header" w:semiHidden="1" w:unhideWhenUsed="1"/>
-    <w:lsdException w:name="Subtitle" w:uiPriority="17" w:qFormat="1"/>
+    <w:lsdException w:name="Subtitle" w:uiPriority="23" w:qFormat="1"/>
     <w:lsdException w:name="Salutation" w:semiHidden="1" w:unhideWhenUsed="1"/>
     <w:lsdException w:name="Date" w:semiHidden="1" w:unhideWhenUsed="1"/>
     <w:lsdException w:name="Body Text First Indent" w:semiHidden="1" w:unhideWhenUsed="1"/>
@@ -426,8 +1537,8 @@
     <w:lsdException w:name="Block Text" w:semiHidden="1" w:unhideWhenUsed="1"/>
     <w:lsdException w:name="Hyperlink" w:semiHidden="1" w:unhideWhenUsed="1"/>
     <w:lsdException w:name="FollowedHyperlink" w:semiHidden="1" w:unhideWhenUsed="1"/>
-    <w:lsdException w:name="Strong" w:uiPriority="34" w:qFormat="1"/>
-    <w:lsdException w:name="Emphasis" w:uiPriority="32" w:qFormat="1"/>
+    <w:lsdException w:name="Strong" w:uiPriority="52" w:qFormat="1"/>
+    <w:lsdException w:name="Emphasis" w:uiPriority="50" w:qFormat="1"/>
     <w:lsdException w:name="Document Map" w:semiHidden="1" w:unhideWhenUsed="1"/>
     <w:lsdException w:name="Plain Text" w:semiHidden="1" w:unhideWhenUsed="1"/>
     <w:lsdException w:name="E-mail Signature" w:semiHidden="1" w:unhideWhenUsed="1"/>
@@ -493,223 +1604,223 @@
     <w:lsdException w:name="Table Web 2" w:semiHidden="1" w:unhideWhenUsed="1"/>
     <w:lsdException w:name="Table Web 3" w:semiHidden="1" w:unhideWhenUsed="1"/>
     <w:lsdException w:name="Balloon Text" w:semiHidden="1" w:unhideWhenUsed="1"/>
-    <w:lsdException w:name="Table Grid" w:uiPriority="57"/>
+    <w:lsdException w:name="Table Grid" w:uiPriority="87"/>
     <w:lsdException w:name="Table Theme" w:semiHidden="1" w:unhideWhenUsed="1"/>
     <w:lsdException w:name="Placeholder Text" w:semiHidden="1"/>
     <w:lsdException w:name="No Spacing" w:uiPriority="1" w:qFormat="1"/>
-    <w:lsdException w:name="Light Shading" w:uiPriority="96"/>
-    <w:lsdException w:name="Light List" w:uiPriority="97"/>
-    <w:lsdException w:name="Light Grid" w:uiPriority="98"/>
-    <w:lsdException w:name="Medium Shading 1" w:uiPriority="99"/>
-    <w:lsdException w:name="Medium Shading 2" w:uiPriority="100"/>
-    <w:lsdException w:name="Medium List 1" w:uiPriority="101"/>
-    <w:lsdException w:name="Medium List 2" w:uiPriority="102"/>
-    <w:lsdException w:name="Medium Grid 1" w:uiPriority="103"/>
-    <w:lsdException w:name="Medium Grid 2" w:uiPriority="104"/>
-    <w:lsdException w:name="Medium Grid 3" w:uiPriority="105"/>
-    <w:lsdException w:name="Dark List" w:uiPriority="112"/>
-    <w:lsdException w:name="Colorful Shading" w:uiPriority="113"/>
-    <w:lsdException w:name="Colorful List" w:uiPriority="114"/>
-    <w:lsdException w:name="Colorful Grid" w:uiPriority="115"/>
-    <w:lsdException w:name="Light Shading Accent 1" w:uiPriority="96"/>
-    <w:lsdException w:name="Light List Accent 1" w:uiPriority="97"/>
-    <w:lsdException w:name="Light Grid Accent 1" w:uiPriority="98"/>
-    <w:lsdException w:name="Medium Shading 1 Accent 1" w:uiPriority="99"/>
-    <w:lsdException w:name="Medium Shading 2 Accent 1" w:uiPriority="100"/>
-    <w:lsdException w:name="Medium List 1 Accent 1" w:uiPriority="101"/>
+    <w:lsdException w:name="Light Shading" w:uiPriority="150"/>
+    <w:lsdException w:name="Light List" w:uiPriority="151"/>
+    <w:lsdException w:name="Light Grid" w:uiPriority="152"/>
+    <w:lsdException w:name="Medium Shading 1" w:uiPriority="153"/>
+    <w:lsdException w:name="Medium Shading 2" w:uiPriority="256"/>
+    <w:lsdException w:name="Medium List 1" w:uiPriority="257"/>
+    <w:lsdException w:name="Medium List 2" w:uiPriority="258"/>
+    <w:lsdException w:name="Medium Grid 1" w:uiPriority="259"/>
+    <w:lsdException w:name="Medium Grid 2" w:uiPriority="260"/>
+    <w:lsdException w:name="Medium Grid 3" w:uiPriority="261"/>
+    <w:lsdException w:name="Dark List" w:uiPriority="274"/>
+    <w:lsdException w:name="Colorful Shading" w:uiPriority="275"/>
+    <w:lsdException w:name="Colorful List" w:uiPriority="276"/>
+    <w:lsdException w:name="Colorful Grid" w:uiPriority="277"/>
+    <w:lsdException w:name="Light Shading Accent 1" w:uiPriority="150"/>
+    <w:lsdException w:name="Light List Accent 1" w:uiPriority="151"/>
+    <w:lsdException w:name="Light Grid Accent 1" w:uiPriority="152"/>
+    <w:lsdException w:name="Medium Shading 1 Accent 1" w:uiPriority="153"/>
+    <w:lsdException w:name="Medium Shading 2 Accent 1" w:uiPriority="256"/>
+    <w:lsdException w:name="Medium List 1 Accent 1" w:uiPriority="257"/>
     <w:lsdException w:name="Revision" w:semiHidden="1"/>
-    <w:lsdException w:name="List Paragraph" w:uiPriority="52" w:qFormat="1"/>
-    <w:lsdException w:name="Quote" w:uiPriority="41" w:qFormat="1"/>
-    <w:lsdException w:name="Intense Quote" w:uiPriority="48" w:qFormat="1"/>
-    <w:lsdException w:name="Medium List 2 Accent 1" w:uiPriority="102"/>
-    <w:lsdException w:name="Medium Grid 1 Accent 1" w:uiPriority="103"/>
-    <w:lsdException w:name="Medium Grid 2 Accent 1" w:uiPriority="104"/>
-    <w:lsdException w:name="Medium Grid 3 Accent 1" w:uiPriority="105"/>
-    <w:lsdException w:name="Dark List Accent 1" w:uiPriority="112"/>
-    <w:lsdException w:name="Colorful Shading Accent 1" w:uiPriority="113"/>
-    <w:lsdException w:name="Colorful List Accent 1" w:uiPriority="114"/>
-    <w:lsdException w:name="Colorful Grid Accent 1" w:uiPriority="115"/>
-    <w:lsdException w:name="Light Shading Accent 2" w:uiPriority="96"/>
-    <w:lsdException w:name="Light List Accent 2" w:uiPriority="97"/>
-    <w:lsdException w:name="Light Grid Accent 2" w:uiPriority="98"/>
-    <w:lsdException w:name="Medium Shading 1 Accent 2" w:uiPriority="99"/>
-    <w:lsdException w:name="Medium Shading 2 Accent 2" w:uiPriority="100"/>
-    <w:lsdException w:name="Medium List 1 Accent 2" w:uiPriority="101"/>
-    <w:lsdException w:name="Medium List 2 Accent 2" w:uiPriority="102"/>
-    <w:lsdException w:name="Medium Grid 1 Accent 2" w:uiPriority="103"/>
-    <w:lsdException w:name="Medium Grid 2 Accent 2" w:uiPriority="104"/>
-    <w:lsdException w:name="Medium Grid 3 Accent 2" w:uiPriority="105"/>
-    <w:lsdException w:name="Dark List Accent 2" w:uiPriority="112"/>
-    <w:lsdException w:name="Colorful Shading Accent 2" w:uiPriority="113"/>
-    <w:lsdException w:name="Colorful List Accent 2" w:uiPriority="114"/>
-    <w:lsdException w:name="Colorful Grid Accent 2" w:uiPriority="115"/>
-    <w:lsdException w:name="Light Shading Accent 3" w:uiPriority="96"/>
-    <w:lsdException w:name="Light List Accent 3" w:uiPriority="97"/>
-    <w:lsdException w:name="Light Grid Accent 3" w:uiPriority="98"/>
-    <w:lsdException w:name="Medium Shading 1 Accent 3" w:uiPriority="99"/>
-    <w:lsdException w:name="Medium Shading 2 Accent 3" w:uiPriority="100"/>
-    <w:lsdException w:name="Medium List 1 Accent 3" w:uiPriority="101"/>
-    <w:lsdException w:name="Medium List 2 Accent 3" w:uiPriority="102"/>
-    <w:lsdException w:name="Medium Grid 1 Accent 3" w:uiPriority="103"/>
-    <w:lsdException w:name="Medium Grid 2 Accent 3" w:uiPriority="104"/>
-    <w:lsdException w:name="Medium Grid 3 Accent 3" w:uiPriority="105"/>
-    <w:lsdException w:name="Dark List Accent 3" w:uiPriority="112"/>
-    <w:lsdException w:name="Colorful Shading Accent 3" w:uiPriority="113"/>
-    <w:lsdException w:name="Colorful List Accent 3" w:uiPriority="114"/>
-    <w:lsdException w:name="Colorful Grid Accent 3" w:uiPriority="115"/>
-    <w:lsdException w:name="Light Shading Accent 4" w:uiPriority="96"/>
-    <w:lsdException w:name="Light List Accent 4" w:uiPriority="97"/>
-    <w:lsdException w:name="Light Grid Accent 4" w:uiPriority="98"/>
-    <w:lsdException w:name="Medium Shading 1 Accent 4" w:uiPriority="99"/>
-    <w:lsdException w:name="Medium Shading 2 Accent 4" w:uiPriority="100"/>
-    <w:lsdException w:name="Medium List 1 Accent 4" w:uiPriority="101"/>
-    <w:lsdException w:name="Medium List 2 Accent 4" w:uiPriority="102"/>
-    <w:lsdException w:name="Medium Grid 1 Accent 4" w:uiPriority="103"/>
-    <w:lsdException w:name="Medium Grid 2 Accent 4" w:uiPriority="104"/>
-    <w:lsdException w:name="Medium Grid 3 Accent 4" w:uiPriority="105"/>
-    <w:lsdException w:name="Dark List Accent 4" w:uiPriority="112"/>
-    <w:lsdException w:name="Colorful Shading Accent 4" w:uiPriority="113"/>
-    <w:lsdException w:name="Colorful List Accent 4" w:uiPriority="114"/>
-    <w:lsdException w:name="Colorful Grid Accent 4" w:uiPriority="115"/>
-    <w:lsdException w:name="Light Shading Accent 5" w:uiPriority="96"/>
-    <w:lsdException w:name="Light List Accent 5" w:uiPriority="97"/>
-    <w:lsdException w:name="Light Grid Accent 5" w:uiPriority="98"/>
-    <w:lsdException w:name="Medium Shading 1 Accent 5" w:uiPriority="99"/>
-    <w:lsdException w:name="Medium Shading 2 Accent 5" w:uiPriority="100"/>
-    <w:lsdException w:name="Medium List 1 Accent 5" w:uiPriority="101"/>
-    <w:lsdException w:name="Medium List 2 Accent 5" w:uiPriority="102"/>
-    <w:lsdException w:name="Medium Grid 1 Accent 5" w:uiPriority="103"/>
-    <w:lsdException w:name="Medium Grid 2 Accent 5" w:uiPriority="104"/>
-    <w:lsdException w:name="Medium Grid 3 Accent 5" w:uiPriority="105"/>
-    <w:lsdException w:name="Dark List Accent 5" w:uiPriority="112"/>
-    <w:lsdException w:name="Colorful Shading Accent 5" w:uiPriority="113"/>
-    <w:lsdException w:name="Colorful List Accent 5" w:uiPriority="114"/>
-    <w:lsdException w:name="Colorful Grid Accent 5" w:uiPriority="115"/>
-    <w:lsdException w:name="Light Shading Accent 6" w:uiPriority="96"/>
-    <w:lsdException w:name="Light List Accent 6" w:uiPriority="97"/>
-    <w:lsdException w:name="Light Grid Accent 6" w:uiPriority="98"/>
-    <w:lsdException w:name="Medium Shading 1 Accent 6" w:uiPriority="99"/>
-    <w:lsdException w:name="Medium Shading 2 Accent 6" w:uiPriority="100"/>
-    <w:lsdException w:name="Medium List 1 Accent 6" w:uiPriority="101"/>
-    <w:lsdException w:name="Medium List 2 Accent 6" w:uiPriority="102"/>
-    <w:lsdException w:name="Medium Grid 1 Accent 6" w:uiPriority="103"/>
-    <w:lsdException w:name="Medium Grid 2 Accent 6" w:uiPriority="104"/>
-    <w:lsdException w:name="Medium Grid 3 Accent 6" w:uiPriority="105"/>
-    <w:lsdException w:name="Dark List Accent 6" w:uiPriority="112"/>
-    <w:lsdException w:name="Colorful Shading Accent 6" w:uiPriority="113"/>
-    <w:lsdException w:name="Colorful List Accent 6" w:uiPriority="114"/>
-    <w:lsdException w:name="Colorful Grid Accent 6" w:uiPriority="115"/>
-    <w:lsdException w:name="Subtle Emphasis" w:uiPriority="25" w:qFormat="1"/>
-    <w:lsdException w:name="Intense Emphasis" w:uiPriority="33" w:qFormat="1"/>
-    <w:lsdException w:name="Subtle Reference" w:uiPriority="49" w:qFormat="1"/>
-    <w:lsdException w:name="Intense Reference" w:uiPriority="50" w:qFormat="1"/>
-    <w:lsdException w:name="Book Title" w:uiPriority="51" w:qFormat="1"/>
-    <w:lsdException w:name="Bibliography" w:semiHidden="1" w:uiPriority="55" w:unhideWhenUsed="1"/>
-    <w:lsdException w:name="TOC Heading" w:semiHidden="1" w:uiPriority="57" w:unhideWhenUsed="1" w:qFormat="1"/>
-    <w:lsdException w:name="Plain Table 1" w:uiPriority="65"/>
-    <w:lsdException w:name="Plain Table 2" w:uiPriority="66"/>
-    <w:lsdException w:name="Plain Table 3" w:uiPriority="67"/>
-    <w:lsdException w:name="Plain Table 4" w:uiPriority="68"/>
-    <w:lsdException w:name="Plain Table 5" w:uiPriority="69"/>
-    <w:lsdException w:name="Grid Table Light" w:uiPriority="64"/>
-    <w:lsdException w:name="Grid Table 1 Light" w:uiPriority="70"/>
-    <w:lsdException w:name="Grid Table 2" w:uiPriority="71"/>
-    <w:lsdException w:name="Grid Table 3" w:uiPriority="72"/>
-    <w:lsdException w:name="Grid Table 4" w:uiPriority="73"/>
-    <w:lsdException w:name="Grid Table 5 Dark" w:uiPriority="80"/>
-    <w:lsdException w:name="Grid Table 6 Colorful" w:uiPriority="81"/>
-    <w:lsdException w:name="Grid Table 7 Colorful" w:uiPriority="82"/>
-    <w:lsdException w:name="Grid Table 1 Light Accent 1" w:uiPriority="70"/>
-    <w:lsdException w:name="Grid Table 2 Accent 1" w:uiPriority="71"/>
-    <w:lsdException w:name="Grid Table 3 Accent 1" w:uiPriority="72"/>
-    <w:lsdException w:name="Grid Table 4 Accent 1" w:uiPriority="73"/>
-    <w:lsdException w:name="Grid Table 5 Dark Accent 1" w:uiPriority="80"/>
-    <w:lsdException w:name="Grid Table 6 Colorful Accent 1" w:uiPriority="81"/>
-    <w:lsdException w:name="Grid Table 7 Colorful Accent 1" w:uiPriority="82"/>
-    <w:lsdException w:name="Grid Table 1 Light Accent 2" w:uiPriority="70"/>
-    <w:lsdException w:name="Grid Table 2 Accent 2" w:uiPriority="71"/>
-    <w:lsdException w:name="Grid Table 3 Accent 2" w:uiPriority="72"/>
-    <w:lsdException w:name="Grid Table 4 Accent 2" w:uiPriority="73"/>
-    <w:lsdException w:name="Grid Table 5 Dark Accent 2" w:uiPriority="80"/>
-    <w:lsdException w:name="Grid Table 6 Colorful Accent 2" w:uiPriority="81"/>
-    <w:lsdException w:name="Grid Table 7 Colorful Accent 2" w:uiPriority="82"/>
-    <w:lsdException w:name="Grid Table 1 Light Accent 3" w:uiPriority="70"/>
-    <w:lsdException w:name="Grid Table 2 Accent 3" w:uiPriority="71"/>
-    <w:lsdException w:name="Grid Table 3 Accent 3" w:uiPriority="72"/>
-    <w:lsdException w:name="Grid Table 4 Accent 3" w:uiPriority="73"/>
-    <w:lsdException w:name="Grid Table 5 Dark Accent 3" w:uiPriority="80"/>
-    <w:lsdException w:name="Grid Table 6 Colorful Accent 3" w:uiPriority="81"/>
-    <w:lsdException w:name="Grid Table 7 Colorful Accent 3" w:uiPriority="82"/>
-    <w:lsdException w:name="Grid Table 1 Light Accent 4" w:uiPriority="70"/>
-    <w:lsdException w:name="Grid Table 2 Accent 4" w:uiPriority="71"/>
-    <w:lsdException w:name="Grid Table 3 Accent 4" w:uiPriority="72"/>
-    <w:lsdException w:name="Grid Table 4 Accent 4" w:uiPriority="73"/>
-    <w:lsdException w:name="Grid Table 5 Dark Accent 4" w:uiPriority="80"/>
-    <w:lsdException w:name="Grid Table 6 Colorful Accent 4" w:uiPriority="81"/>
-    <w:lsdException w:name="Grid Table 7 Colorful Accent 4" w:uiPriority="82"/>
-    <w:lsdException w:name="Grid Table 1 Light Accent 5" w:uiPriority="70"/>
-    <w:lsdException w:name="Grid Table 2 Accent 5" w:uiPriority="71"/>
-    <w:lsdException w:name="Grid Table 3 Accent 5" w:uiPriority="72"/>
-    <w:lsdException w:name="Grid Table 4 Accent 5" w:uiPriority="73"/>
-    <w:lsdException w:name="Grid Table 5 Dark Accent 5" w:uiPriority="80"/>
-    <w:lsdException w:name="Grid Table 6 Colorful Accent 5" w:uiPriority="81"/>
-    <w:lsdException w:name="Grid Table 7 Colorful Accent 5" w:uiPriority="82"/>
-    <w:lsdException w:name="Grid Table 1 Light Accent 6" w:uiPriority="70"/>
-    <w:lsdException w:name="Grid Table 2 Accent 6" w:uiPriority="71"/>
-    <w:lsdException w:name="Grid Table 3 Accent 6" w:uiPriority="72"/>
-    <w:lsdException w:name="Grid Table 4 Accent 6" w:uiPriority="73"/>
-    <w:lsdException w:name="Grid Table 5 Dark Accent 6" w:uiPriority="80"/>
-    <w:lsdException w:name="Grid Table 6 Colorful Accent 6" w:uiPriority="81"/>
-    <w:lsdException w:name="Grid Table 7 Colorful Accent 6" w:uiPriority="82"/>
-    <w:lsdException w:name="List Table 1 Light" w:uiPriority="70"/>
-    <w:lsdException w:name="List Table 2" w:uiPriority="71"/>
-    <w:lsdException w:name="List Table 3" w:uiPriority="72"/>
-    <w:lsdException w:name="List Table 4" w:uiPriority="73"/>
-    <w:lsdException w:name="List Table 5 Dark" w:uiPriority="80"/>
-    <w:lsdException w:name="List Table 6 Colorful" w:uiPriority="81"/>
-    <w:lsdException w:name="List Table 7 Colorful" w:uiPriority="82"/>
-    <w:lsdException w:name="List Table 1 Light Accent 1" w:uiPriority="70"/>
-    <w:lsdException w:name="List Table 2 Accent 1" w:uiPriority="71"/>
-    <w:lsdException w:name="List Table 3 Accent 1" w:uiPriority="72"/>
-    <w:lsdException w:name="List Table 4 Accent 1" w:uiPriority="73"/>
-    <w:lsdException w:name="List Table 5 Dark Accent 1" w:uiPriority="80"/>
-    <w:lsdException w:name="List Table 6 Colorful Accent 1" w:uiPriority="81"/>
-    <w:lsdException w:name="List Table 7 Colorful Accent 1" w:uiPriority="82"/>
-    <w:lsdException w:name="List Table 1 Light Accent 2" w:uiPriority="70"/>
-    <w:lsdException w:name="List Table 2 Accent 2" w:uiPriority="71"/>
-    <w:lsdException w:name="List Table 3 Accent 2" w:uiPriority="72"/>
-    <w:lsdException w:name="List Table 4 Accent 2" w:uiPriority="73"/>
-    <w:lsdException w:name="List Table 5 Dark Accent 2" w:uiPriority="80"/>
-    <w:lsdException w:name="List Table 6 Colorful Accent 2" w:uiPriority="81"/>
-    <w:lsdException w:name="List Table 7 Colorful Accent 2" w:uiPriority="82"/>
-    <w:lsdException w:name="List Table 1 Light Accent 3" w:uiPriority="70"/>
-    <w:lsdException w:name="List Table 2 Accent 3" w:uiPriority="71"/>
-    <w:lsdException w:name="List Table 3 Accent 3" w:uiPriority="72"/>
-    <w:lsdException w:name="List Table 4 Accent 3" w:uiPriority="73"/>
-    <w:lsdException w:name="List Table 5 Dark Accent 3" w:uiPriority="80"/>
-    <w:lsdException w:name="List Table 6 Colorful Accent 3" w:uiPriority="81"/>
-    <w:lsdException w:name="List Table 7 Colorful Accent 3" w:uiPriority="82"/>
-    <w:lsdException w:name="List Table 1 Light Accent 4" w:uiPriority="70"/>
-    <w:lsdException w:name="List Table 2 Accent 4" w:uiPriority="71"/>
-    <w:lsdException w:name="List Table 3 Accent 4" w:uiPriority="72"/>
-    <w:lsdException w:name="List Table 4 Accent 4" w:uiPriority="73"/>
-    <w:lsdException w:name="List Table 5 Dark Accent 4" w:uiPriority="80"/>
-    <w:lsdException w:name="List Table 6 Colorful Accent 4" w:uiPriority="81"/>
-    <w:lsdException w:name="List Table 7 Colorful Accent 4" w:uiPriority="82"/>
-    <w:lsdException w:name="List Table 1 Light Accent 5" w:uiPriority="70"/>
-    <w:lsdException w:name="List Table 2 Accent 5" w:uiPriority="71"/>
-    <w:lsdException w:name="List Table 3 Accent 5" w:uiPriority="72"/>
-    <w:lsdException w:name="List Table 4 Accent 5" w:uiPriority="73"/>
-    <w:lsdException w:name="List Table 5 Dark Accent 5" w:uiPriority="80"/>
-    <w:lsdException w:name="List Table 6 Colorful Accent 5" w:uiPriority="81"/>
-    <w:lsdException w:name="List Table 7 Colorful Accent 5" w:uiPriority="82"/>
-    <w:lsdException w:name="List Table 1 Light Accent 6" w:uiPriority="70"/>
-    <w:lsdException w:name="List Table 2 Accent 6" w:uiPriority="71"/>
-    <w:lsdException w:name="List Table 3 Accent 6" w:uiPriority="72"/>
-    <w:lsdException w:name="List Table 4 Accent 6" w:uiPriority="73"/>
-    <w:lsdException w:name="List Table 5 Dark Accent 6" w:uiPriority="80"/>
-    <w:lsdException w:name="List Table 6 Colorful Accent 6" w:uiPriority="81"/>
-    <w:lsdException w:name="List Table 7 Colorful Accent 6" w:uiPriority="82"/>
+    <w:lsdException w:name="List Paragraph" w:uiPriority="82" w:qFormat="1"/>
+    <w:lsdException w:name="Quote" w:uiPriority="65" w:qFormat="1"/>
+    <w:lsdException w:name="Intense Quote" w:uiPriority="72" w:qFormat="1"/>
+    <w:lsdException w:name="Medium List 2 Accent 1" w:uiPriority="258"/>
+    <w:lsdException w:name="Medium Grid 1 Accent 1" w:uiPriority="259"/>
+    <w:lsdException w:name="Medium Grid 2 Accent 1" w:uiPriority="260"/>
+    <w:lsdException w:name="Medium Grid 3 Accent 1" w:uiPriority="261"/>
+    <w:lsdException w:name="Dark List Accent 1" w:uiPriority="274"/>
+    <w:lsdException w:name="Colorful Shading Accent 1" w:uiPriority="275"/>
+    <w:lsdException w:name="Colorful List Accent 1" w:uiPriority="276"/>
+    <w:lsdException w:name="Colorful Grid Accent 1" w:uiPriority="277"/>
+    <w:lsdException w:name="Light Shading Accent 2" w:uiPriority="150"/>
+    <w:lsdException w:name="Light List Accent 2" w:uiPriority="151"/>
+    <w:lsdException w:name="Light Grid Accent 2" w:uiPriority="152"/>
+    <w:lsdException w:name="Medium Shading 1 Accent 2" w:uiPriority="153"/>
+    <w:lsdException w:name="Medium Shading 2 Accent 2" w:uiPriority="256"/>
+    <w:lsdException w:name="Medium List 1 Accent 2" w:uiPriority="257"/>
+    <w:lsdException w:name="Medium List 2 Accent 2" w:uiPriority="258"/>
+    <w:lsdException w:name="Medium Grid 1 Accent 2" w:uiPriority="259"/>
+    <w:lsdException w:name="Medium Grid 2 Accent 2" w:uiPriority="260"/>
+    <w:lsdException w:name="Medium Grid 3 Accent 2" w:uiPriority="261"/>
+    <w:lsdException w:name="Dark List Accent 2" w:uiPriority="274"/>
+    <w:lsdException w:name="Colorful Shading Accent 2" w:uiPriority="275"/>
+    <w:lsdException w:name="Colorful List Accent 2" w:uiPriority="276"/>
+    <w:lsdException w:name="Colorful Grid Accent 2" w:uiPriority="277"/>
+    <w:lsdException w:name="Light Shading Accent 3" w:uiPriority="150"/>
+    <w:lsdException w:name="Light List Accent 3" w:uiPriority="151"/>
+    <w:lsdException w:name="Light Grid Accent 3" w:uiPriority="152"/>
+    <w:lsdException w:name="Medium Shading 1 Accent 3" w:uiPriority="153"/>
+    <w:lsdException w:name="Medium Shading 2 Accent 3" w:uiPriority="256"/>
+    <w:lsdException w:name="Medium List 1 Accent 3" w:uiPriority="257"/>
+    <w:lsdException w:name="Medium List 2 Accent 3" w:uiPriority="258"/>
+    <w:lsdException w:name="Medium Grid 1 Accent 3" w:uiPriority="259"/>
+    <w:lsdException w:name="Medium Grid 2 Accent 3" w:uiPriority="260"/>
+    <w:lsdException w:name="Medium Grid 3 Accent 3" w:uiPriority="261"/>
+    <w:lsdException w:name="Dark List Accent 3" w:uiPriority="274"/>
+    <w:lsdException w:name="Colorful Shading Accent 3" w:uiPriority="275"/>
+    <w:lsdException w:name="Colorful List Accent 3" w:uiPriority="276"/>
+    <w:lsdException w:name="Colorful Grid Accent 3" w:uiPriority="277"/>
+    <w:lsdException w:name="Light Shading Accent 4" w:uiPriority="150"/>
+    <w:lsdException w:name="Light List Accent 4" w:uiPriority="151"/>
+    <w:lsdException w:name="Light Grid Accent 4" w:uiPriority="152"/>
+    <w:lsdException w:name="Medium Shading 1 Accent 4" w:uiPriority="153"/>
+    <w:lsdException w:name="Medium Shading 2 Accent 4" w:uiPriority="256"/>
+    <w:lsdException w:name="Medium List 1 Accent 4" w:uiPriority="257"/>
+    <w:lsdException w:name="Medium List 2 Accent 4" w:uiPriority="258"/>
+    <w:lsdException w:name="Medium Grid 1 Accent 4" w:uiPriority="259"/>
+    <w:lsdException w:name="Medium Grid 2 Accent 4" w:uiPriority="260"/>
+    <w:lsdException w:name="Medium Grid 3 Accent 4" w:uiPriority="261"/>
+    <w:lsdException w:name="Dark List Accent 4" w:uiPriority="274"/>
+    <w:lsdException w:name="Colorful Shading Accent 4" w:uiPriority="275"/>
+    <w:lsdException w:name="Colorful List Accent 4" w:uiPriority="276"/>
+    <w:lsdException w:name="Colorful Grid Accent 4" w:uiPriority="277"/>
+    <w:lsdException w:name="Light Shading Accent 5" w:uiPriority="150"/>
+    <w:lsdException w:name="Light List Accent 5" w:uiPriority="151"/>
+    <w:lsdException w:name="Light Grid Accent 5" w:uiPriority="152"/>
+    <w:lsdException w:name="Medium Shading 1 Accent 5" w:uiPriority="153"/>
+    <w:lsdException w:name="Medium Shading 2 Accent 5" w:uiPriority="256"/>
+    <w:lsdException w:name="Medium List 1 Accent 5" w:uiPriority="257"/>
+    <w:lsdException w:name="Medium List 2 Accent 5" w:uiPriority="258"/>
+    <w:lsdException w:name="Medium Grid 1 Accent 5" w:uiPriority="259"/>
+    <w:lsdException w:name="Medium Grid 2 Accent 5" w:uiPriority="260"/>
+    <w:lsdException w:name="Medium Grid 3 Accent 5" w:uiPriority="261"/>
+    <w:lsdException w:name="Dark List Accent 5" w:uiPriority="274"/>
+    <w:lsdException w:name="Colorful Shading Accent 5" w:uiPriority="275"/>
+    <w:lsdException w:name="Colorful List Accent 5" w:uiPriority="276"/>
+    <w:lsdException w:name="Colorful Grid Accent 5" w:uiPriority="277"/>
+    <w:lsdException w:name="Light Shading Accent 6" w:uiPriority="150"/>
+    <w:lsdException w:name="Light List Accent 6" w:uiPriority="151"/>
+    <w:lsdException w:name="Light Grid Accent 6" w:uiPriority="152"/>
+    <w:lsdException w:name="Medium Shading 1 Accent 6" w:uiPriority="153"/>
+    <w:lsdException w:name="Medium Shading 2 Accent 6" w:uiPriority="256"/>
+    <w:lsdException w:name="Medium List 1 Accent 6" w:uiPriority="257"/>
+    <w:lsdException w:name="Medium List 2 Accent 6" w:uiPriority="258"/>
+    <w:lsdException w:name="Medium Grid 1 Accent 6" w:uiPriority="259"/>
+    <w:lsdException w:name="Medium Grid 2 Accent 6" w:uiPriority="260"/>
+    <w:lsdException w:name="Medium Grid 3 Accent 6" w:uiPriority="261"/>
+    <w:lsdException w:name="Dark List Accent 6" w:uiPriority="274"/>
+    <w:lsdException w:name="Colorful Shading Accent 6" w:uiPriority="275"/>
+    <w:lsdException w:name="Colorful List Accent 6" w:uiPriority="276"/>
+    <w:lsdException w:name="Colorful Grid Accent 6" w:uiPriority="277"/>
+    <w:lsdException w:name="Subtle Emphasis" w:uiPriority="37" w:qFormat="1"/>
+    <w:lsdException w:name="Intense Emphasis" w:uiPriority="51" w:qFormat="1"/>
+    <w:lsdException w:name="Subtle Reference" w:uiPriority="73" w:qFormat="1"/>
+    <w:lsdException w:name="Intense Reference" w:uiPriority="80" w:qFormat="1"/>
+    <w:lsdException w:name="Book Title" w:uiPriority="81" w:qFormat="1"/>
+    <w:lsdException w:name="Bibliography" w:semiHidden="1" w:uiPriority="85" w:unhideWhenUsed="1"/>
+    <w:lsdException w:name="TOC Heading" w:semiHidden="1" w:uiPriority="87" w:unhideWhenUsed="1" w:qFormat="1"/>
+    <w:lsdException w:name="Plain Table 1" w:uiPriority="101"/>
+    <w:lsdException w:name="Plain Table 2" w:uiPriority="102"/>
+    <w:lsdException w:name="Plain Table 3" w:uiPriority="103"/>
+    <w:lsdException w:name="Plain Table 4" w:uiPriority="104"/>
+    <w:lsdException w:name="Plain Table 5" w:uiPriority="105"/>
+    <w:lsdException w:name="Grid Table Light" w:uiPriority="100"/>
+    <w:lsdException w:name="Grid Table 1 Light" w:uiPriority="112"/>
+    <w:lsdException w:name="Grid Table 2" w:uiPriority="113"/>
+    <w:lsdException w:name="Grid Table 3" w:uiPriority="114"/>
+    <w:lsdException w:name="Grid Table 4" w:uiPriority="115"/>
+    <w:lsdException w:name="Grid Table 5 Dark" w:uiPriority="128"/>
+    <w:lsdException w:name="Grid Table 6 Colorful" w:uiPriority="129"/>
+    <w:lsdException w:name="Grid Table 7 Colorful" w:uiPriority="130"/>
+    <w:lsdException w:name="Grid Table 1 Light Accent 1" w:uiPriority="112"/>
+    <w:lsdException w:name="Grid Table 2 Accent 1" w:uiPriority="113"/>
+    <w:lsdException w:name="Grid Table 3 Accent 1" w:uiPriority="114"/>
+    <w:lsdException w:name="Grid Table 4 Accent 1" w:uiPriority="115"/>
+    <w:lsdException w:name="Grid Table 5 Dark Accent 1" w:uiPriority="128"/>
+    <w:lsdException w:name="Grid Table 6 Colorful Accent 1" w:uiPriority="129"/>
+    <w:lsdException w:name="Grid Table 7 Colorful Accent 1" w:uiPriority="130"/>
+    <w:lsdException w:name="Grid Table 1 Light Accent 2" w:uiPriority="112"/>
+    <w:lsdException w:name="Grid Table 2 Accent 2" w:uiPriority="113"/>
+    <w:lsdException w:name="Grid Table 3 Accent 2" w:uiPriority="114"/>
+    <w:lsdException w:name="Grid Table 4 Accent 2" w:uiPriority="115"/>
+    <w:lsdException w:name="Grid Table 5 Dark Accent 2" w:uiPriority="128"/>
+    <w:lsdException w:name="Grid Table 6 Colorful Accent 2" w:uiPriority="129"/>
+    <w:lsdException w:name="Grid Table 7 Colorful Accent 2" w:uiPriority="130"/>
+    <w:lsdException w:name="Grid Table 1 Light Accent 3" w:uiPriority="112"/>
+    <w:lsdException w:name="Grid Table 2 Accent 3" w:uiPriority="113"/>
+    <w:lsdException w:name="Grid Table 3 Accent 3" w:uiPriority="114"/>
+    <w:lsdException w:name="Grid Table 4 Accent 3" w:uiPriority="115"/>
+    <w:lsdException w:name="Grid Table 5 Dark Accent 3" w:uiPriority="128"/>
+    <w:lsdException w:name="Grid Table 6 Colorful Accent 3" w:uiPriority="129"/>
+    <w:lsdException w:name="Grid Table 7 Colorful Accent 3" w:uiPriority="130"/>
+    <w:lsdException w:name="Grid Table 1 Light Accent 4" w:uiPriority="112"/>
+    <w:lsdException w:name="Grid Table 2 Accent 4" w:uiPriority="113"/>
+    <w:lsdException w:name="Grid Table 3 Accent 4" w:uiPriority="114"/>
+    <w:lsdException w:name="Grid Table 4 Accent 4" w:uiPriority="115"/>
+    <w:lsdException w:name="Grid Table 5 Dark Accent 4" w:uiPriority="128"/>
+    <w:lsdException w:name="Grid Table 6 Colorful Accent 4" w:uiPriority="129"/>
+    <w:lsdException w:name="Grid Table 7 Colorful Accent 4" w:uiPriority="130"/>
+    <w:lsdException w:name="Grid Table 1 Light Accent 5" w:uiPriority="112"/>
+    <w:lsdException w:name="Grid Table 2 Accent 5" w:uiPriority="113"/>
+    <w:lsdException w:name="Grid Table 3 Accent 5" w:uiPriority="114"/>
+    <w:lsdException w:name="Grid Table 4 Accent 5" w:uiPriority="115"/>
+    <w:lsdException w:name="Grid Table 5 Dark Accent 5" w:uiPriority="128"/>
+    <w:lsdException w:name="Grid Table 6 Colorful Accent 5" w:uiPriority="129"/>
+    <w:lsdException w:name="Grid Table 7 Colorful Accent 5" w:uiPriority="130"/>
+    <w:lsdException w:name="Grid Table 1 Light Accent 6" w:uiPriority="112"/>
+    <w:lsdException w:name="Grid Table 2 Accent 6" w:uiPriority="113"/>
+    <w:lsdException w:name="Grid Table 3 Accent 6" w:uiPriority="114"/>
+    <w:lsdException w:name="Grid Table 4 Accent 6" w:uiPriority="115"/>
+    <w:lsdException w:name="Grid Table 5 Dark Accent 6" w:uiPriority="128"/>
+    <w:lsdException w:name="Grid Table 6 Colorful Accent 6" w:uiPriority="129"/>
+    <w:lsdException w:name="Grid Table 7 Colorful Accent 6" w:uiPriority="130"/>
+    <w:lsdException w:name="List Table 1 Light" w:uiPriority="112"/>
+    <w:lsdException w:name="List Table 2" w:uiPriority="113"/>
+    <w:lsdException w:name="List Table 3" w:uiPriority="114"/>
+    <w:lsdException w:name="List Table 4" w:uiPriority="115"/>
+    <w:lsdException w:name="List Table 5 Dark" w:uiPriority="128"/>
+    <w:lsdException w:name="List Table 6 Colorful" w:uiPriority="129"/>
+    <w:lsdException w:name="List Table 7 Colorful" w:uiPriority="130"/>
+    <w:lsdException w:name="List Table 1 Light Accent 1" w:uiPriority="112"/>
+    <w:lsdException w:name="List Table 2 Accent 1" w:uiPriority="113"/>
+    <w:lsdException w:name="List Table 3 Accent 1" w:uiPriority="114"/>
+    <w:lsdException w:name="List Table 4 Accent 1" w:uiPriority="115"/>
+    <w:lsdException w:name="List Table 5 Dark Accent 1" w:uiPriority="128"/>
+    <w:lsdException w:name="List Table 6 Colorful Accent 1" w:uiPriority="129"/>
+    <w:lsdException w:name="List Table 7 Colorful Accent 1" w:uiPriority="130"/>
+    <w:lsdException w:name="List Table 1 Light Accent 2" w:uiPriority="112"/>
+    <w:lsdException w:name="List Table 2 Accent 2" w:uiPriority="113"/>
+    <w:lsdException w:name="List Table 3 Accent 2" w:uiPriority="114"/>
+    <w:lsdException w:name="List Table 4 Accent 2" w:uiPriority="115"/>
+    <w:lsdException w:name="List Table 5 Dark Accent 2" w:uiPriority="128"/>
+    <w:lsdException w:name="List Table 6 Colorful Accent 2" w:uiPriority="129"/>
+    <w:lsdException w:name="List Table 7 Colorful Accent 2" w:uiPriority="130"/>
+    <w:lsdException w:name="List Table 1 Light Accent 3" w:uiPriority="112"/>
+    <w:lsdException w:name="List Table 2 Accent 3" w:uiPriority="113"/>
+    <w:lsdException w:name="List Table 3 Accent 3" w:uiPriority="114"/>
+    <w:lsdException w:name="List Table 4 Accent 3" w:uiPriority="115"/>
+    <w:lsdException w:name="List Table 5 Dark Accent 3" w:uiPriority="128"/>
+    <w:lsdException w:name="List Table 6 Colorful Accent 3" w:uiPriority="129"/>
+    <w:lsdException w:name="List Table 7 Colorful Accent 3" w:uiPriority="130"/>
+    <w:lsdException w:name="List Table 1 Light Accent 4" w:uiPriority="112"/>
+    <w:lsdException w:name="List Table 2 Accent 4" w:uiPriority="113"/>
+    <w:lsdException w:name="List Table 3 Accent 4" w:uiPriority="114"/>
+    <w:lsdException w:name="List Table 4 Accent 4" w:uiPriority="115"/>
+    <w:lsdException w:name="List Table 5 Dark Accent 4" w:uiPriority="128"/>
+    <w:lsdException w:name="List Table 6 Colorful Accent 4" w:uiPriority="129"/>
+    <w:lsdException w:name="List Table 7 Colorful Accent 4" w:uiPriority="130"/>
+    <w:lsdException w:name="List Table 1 Light Accent 5" w:uiPriority="112"/>
+    <w:lsdException w:name="List Table 2 Accent 5" w:uiPriority="113"/>
+    <w:lsdException w:name="List Table 3 Accent 5" w:uiPriority="114"/>
+    <w:lsdException w:name="List Table 4 Accent 5" w:uiPriority="115"/>
+    <w:lsdException w:name="List Table 5 Dark Accent 5" w:uiPriority="128"/>
+    <w:lsdException w:name="List Table 6 Colorful Accent 5" w:uiPriority="129"/>
+    <w:lsdException w:name="List Table 7 Colorful Accent 5" w:uiPriority="130"/>
+    <w:lsdException w:name="List Table 1 Light Accent 6" w:uiPriority="112"/>
+    <w:lsdException w:name="List Table 2 Accent 6" w:uiPriority="113"/>
+    <w:lsdException w:name="List Table 3 Accent 6" w:uiPriority="114"/>
+    <w:lsdException w:name="List Table 4 Accent 6" w:uiPriority="115"/>
+    <w:lsdException w:name="List Table 5 Dark Accent 6" w:uiPriority="128"/>
+    <w:lsdException w:name="List Table 6 Colorful Accent 6" w:uiPriority="129"/>
+    <w:lsdException w:name="List Table 7 Colorful Accent 6" w:uiPriority="130"/>
   </w:latentStyles>
   <w:style w:type="paragraph" w:default="1" w:styleId="a2">
     <w:name w:val="Normal"/>

</xml_diff>